<commit_message>
cambios en diagramas y guion
</commit_message>
<xml_diff>
--- a/Guion_Defensa_TT_2026-B066.docx
+++ b/Guion_Defensa_TT_2026-B066.docx
@@ -633,7 +633,21 @@
           <w:color w:val="222222"/>
           <w:lang w:val="es-MX"/>
         </w:rPr>
-        <w:t>La presentación está organizada en seis secciones. Iniciamos con el contexto y la motivación del problema; pasamos al marco del TT —objetivos y justificación—; luego al fundamento teórico; enseguida a la ingeniería de requisitos; después al diseño del sistema; y cerramos con la validación, las conclusiones y el trabajo futuro.</w:t>
+        <w:t>La presentación está organizada en seis secciones. Iniciamos con el contexto y la motivación del problema; pasamos al marco del TT —objetivos y justificación—; luego al fundamento teórico; enseguida a l</w:t>
+      </w:r>
+      <w:r>
+        <w:rPr>
+          <w:color w:val="222222"/>
+          <w:lang w:val="es-MX"/>
+        </w:rPr>
+        <w:t xml:space="preserve">os </w:t>
+      </w:r>
+      <w:r>
+        <w:rPr>
+          <w:color w:val="222222"/>
+          <w:lang w:val="es-MX"/>
+        </w:rPr>
+        <w:t>requisitos; después al diseño del sistema; y cerramos con la validación, las conclusiones y el trabajo futuro.</w:t>
       </w:r>
     </w:p>
     <w:p>
@@ -4312,13 +4326,23 @@
         <w:lang w:val="es-MX"/>
       </w:rPr>
     </w:pPr>
+    <w:proofErr w:type="spellStart"/>
     <w:r>
       <w:rPr>
         <w:color w:val="888888"/>
         <w:sz w:val="18"/>
         <w:lang w:val="es-MX"/>
       </w:rPr>
-      <w:t>Guión de Defensa · TT 2026-B066 · ESCOM-IPN</w:t>
+      <w:t>Guión</w:t>
+    </w:r>
+    <w:proofErr w:type="spellEnd"/>
+    <w:r>
+      <w:rPr>
+        <w:color w:val="888888"/>
+        <w:sz w:val="18"/>
+        <w:lang w:val="es-MX"/>
+      </w:rPr>
+      <w:t xml:space="preserve"> de Defensa · TT 2026-B066 · ESCOM-IPN</w:t>
     </w:r>
   </w:p>
 </w:hdr>

</xml_diff>